<commit_message>
Normalise sample-log paths and set full student name across reports
</commit_message>
<xml_diff>
--- a/docs/Submission_Template.docx
+++ b/docs/Submission_Template.docx
@@ -173,7 +173,7 @@
                 <w:sz w:val="24"/>
                 <w:szCs w:val="24"/>
               </w:rPr>
-              <w:t>Sora</w:t>
+              <w:t>Rapipong Sornsakda</w:t>
             </w:r>
           </w:p>
         </w:tc>
@@ -364,7 +364,7 @@
                 <w:sz w:val="24"/>
                 <w:szCs w:val="24"/>
               </w:rPr>
-              <w:t>https://github.com/&lt;your-username&gt;/smart-city-traffic-capstone</w:t>
+              <w:t>https://github.com/sorasolarso-sketch/smart-city-traffic-capstone</w:t>
             </w:r>
           </w:p>
         </w:tc>

</xml_diff>